<commit_message>
FIN-12: American spelling in the contract, rebuilt DOCX
Co-Authored-By: Claude Fable 5 <noreply@anthropic.com>
</commit_message>
<xml_diff>
--- a/artifacts/FIN-12/build/vendor-contract-insurance.docx
+++ b/artifacts/FIN-12/build/vendor-contract-insurance.docx
@@ -1800,7 +1800,7 @@
         <w:t xml:space="preserve"> </w:t>
       </w:r>
       <w:r>
-        <w:t xml:space="preserve">A notice under this Agreement must be in writing and delivered by hand, by nationally recognised overnight courier, or by email with confirmation of receipt, to the addresses on the first page or to such other address as a Party notifies under this Section 14.</w:t>
+        <w:t xml:space="preserve">A notice under this Agreement must be in writing and delivered by hand, by nationally recognized overnight courier, or by email with confirmation of receipt, to the addresses on the first page or to such other address as a Party notifies under this Section 14.</w:t>
       </w:r>
     </w:p>
     <w:p>
@@ -1900,7 +1900,7 @@
         <w:t xml:space="preserve"> </w:t>
       </w:r>
       <w:r>
-        <w:t xml:space="preserve">An amendment to this Agreement is effective only if it is in writing and signed by an authorised representative of each Party.</w:t>
+        <w:t xml:space="preserve">An amendment to this Agreement is effective only if it is in writing and signed by an authorized representative of each Party.</w:t>
       </w:r>
     </w:p>
     <w:p>
@@ -2438,7 +2438,7 @@
         <w:pStyle w:val="BodyText"/>
       </w:pPr>
       <w:r>
-        <w:t xml:space="preserve">Millgate executes this Agreement by an authorised signatory under its standing program authority. The individual signing is identified in Millgate’s execution record and is not named on the face of this Agreement.</w:t>
+        <w:t xml:space="preserve">Millgate executes this Agreement by an authorized signatory under its standing program authority. The individual signing is identified in Millgate’s execution record and is not named on the face of this Agreement.</w:t>
       </w:r>
     </w:p>
     <w:bookmarkEnd w:id="26"/>

</xml_diff>